<commit_message>
bao cao tien trinh
</commit_message>
<xml_diff>
--- a/slot14/BaoCao_HSF302_Thymeleaf_DE180216.docx
+++ b/slot14/BaoCao_HSF302_Thymeleaf_DE180216.docx
@@ -73,8 +73,6 @@
         </w:rPr>
         <w:t>MỤC LỤC</w:t>
       </w:r>
-      <w:bookmarkStart w:id="0" w:name="_GoBack"/>
-      <w:bookmarkEnd w:id="0"/>
     </w:p>
     <w:p>
       <w:pPr>
@@ -1061,62 +1059,36 @@
         <w:shd w:val="clear" w:fill="F2F2F2"/>
         <w:ind w:left="360"/>
         <w:rPr>
-          <w:color w:val="auto"/>
-        </w:rPr>
-      </w:pPr>
-      <w:r>
-        <w:rPr>
           <w:rFonts w:ascii="Consolas" w:hAnsi="Consolas"/>
           <w:color w:val="auto"/>
           <w:sz w:val="21"/>
         </w:rPr>
+      </w:pPr>
+      <w:r>
+        <w:rPr>
+          <w:rFonts w:ascii="Consolas" w:hAnsi="Consolas"/>
+          <w:color w:val="auto"/>
+          <w:sz w:val="21"/>
+        </w:rPr>
         <w:t>GO</w:t>
-      </w:r>
-    </w:p>
-    <w:p>
-      <w:pPr>
-        <w:pStyle w:val="2"/>
-        <w:rPr>
-          <w:color w:val="auto"/>
-        </w:rPr>
-      </w:pPr>
-      <w:r>
-        <w:rPr>
-          <w:color w:val="auto"/>
-        </w:rPr>
-        <w:t>6. Bước 4 – Kiểm Tra Biên Dịch Ứng Dụng (mvn clean compile)</w:t>
-      </w:r>
-    </w:p>
-    <w:p>
-      <w:r>
-        <w:t>Thực hiện lệnh build trên Terminal để đảm bảo mã nguồn và các thư viện trong pom.xml không xảy ra xung đột:</w:t>
       </w:r>
     </w:p>
     <w:p>
       <w:pPr>
         <w:shd w:val="clear" w:fill="F2F2F2"/>
         <w:ind w:left="360"/>
-      </w:pPr>
-      <w:r>
         <w:rPr>
           <w:rFonts w:ascii="Consolas" w:hAnsi="Consolas"/>
-          <w:color w:val="333333"/>
+          <w:color w:val="auto"/>
           <w:sz w:val="21"/>
         </w:rPr>
-        <w:t>mvn clean compile</w:t>
-      </w:r>
-    </w:p>
-    <w:p/>
-    <w:p>
-      <w:pPr>
-        <w:jc w:val="center"/>
       </w:pPr>
       <w:r>
         <w:drawing>
           <wp:inline distT="0" distB="0" distL="114300" distR="114300">
-            <wp:extent cx="5039995" cy="559435"/>
-            <wp:effectExtent l="0" t="0" r="0" b="0"/>
-            <wp:docPr id="5578" name="build-success"/>
+            <wp:extent cx="5265420" cy="2959100"/>
+            <wp:effectExtent l="0" t="0" r="11430" b="12700"/>
+            <wp:docPr id="1" name="Picture 1"/>
             <wp:cNvGraphicFramePr>
               <a:graphicFrameLocks xmlns:a="http://schemas.openxmlformats.org/drawingml/2006/main" noChangeAspect="1"/>
             </wp:cNvGraphicFramePr>
@@ -1124,223 +1096,13 @@
               <a:graphicData uri="http://schemas.openxmlformats.org/drawingml/2006/picture">
                 <pic:pic xmlns:pic="http://schemas.openxmlformats.org/drawingml/2006/picture">
                   <pic:nvPicPr>
-                    <pic:cNvPr id="5578" name="build-success"/>
+                    <pic:cNvPr id="1" name="Picture 1"/>
                     <pic:cNvPicPr>
                       <a:picLocks noChangeAspect="1"/>
                     </pic:cNvPicPr>
                   </pic:nvPicPr>
                   <pic:blipFill>
                     <a:blip r:embed="rId8"/>
-                    <a:stretch>
-                      <a:fillRect/>
-                    </a:stretch>
-                  </pic:blipFill>
-                  <pic:spPr>
-                    <a:xfrm>
-                      <a:off x="0" y="0"/>
-                      <a:ext cx="5040000" cy="560000"/>
-                    </a:xfrm>
-                    <a:prstGeom prst="rect">
-                      <a:avLst/>
-                    </a:prstGeom>
-                  </pic:spPr>
-                </pic:pic>
-              </a:graphicData>
-            </a:graphic>
-          </wp:inline>
-        </w:drawing>
-      </w:r>
-    </w:p>
-    <w:p>
-      <w:pPr>
-        <w:jc w:val="center"/>
-      </w:pPr>
-      <w:r>
-        <w:rPr>
-          <w:i/>
-          <w:color w:val="555555"/>
-        </w:rPr>
-        <w:t>Hình 6.1 – Kết quả kiểm tra biên dịch đạt BUILD SUCCESS</w:t>
-      </w:r>
-    </w:p>
-    <w:p>
-      <w:pPr>
-        <w:pStyle w:val="2"/>
-        <w:rPr>
-          <w:color w:val="auto"/>
-        </w:rPr>
-      </w:pPr>
-      <w:r>
-        <w:rPr>
-          <w:color w:val="auto"/>
-        </w:rPr>
-        <w:t>7. Bước 5 – Xây Dựng JPA Entity Student và Validation (TODO 0–3)</w:t>
-      </w:r>
-    </w:p>
-    <w:p>
-      <w:pPr>
-        <w:pStyle w:val="3"/>
-        <w:rPr>
-          <w:color w:val="auto"/>
-        </w:rPr>
-      </w:pPr>
-      <w:r>
-        <w:rPr>
-          <w:color w:val="auto"/>
-        </w:rPr>
-        <w:t>7.1. Định nghĩa Entity JPA và Ánh xạ Bảng CSDL</w:t>
-      </w:r>
-    </w:p>
-    <w:p>
-      <w:r>
-        <w:t>File nguồn: src/main/java/com/hsf302/student/entity/Student.java</w:t>
-      </w:r>
-    </w:p>
-    <w:p>
-      <w:r>
-        <w:t>Sử dụng các annotation JPA: @Entity, @Table(name = "students"), @Id, @GeneratedValue(strategy = GenerationType.IDENTITY), @Column.</w:t>
-      </w:r>
-    </w:p>
-    <w:p>
-      <w:pPr>
-        <w:pStyle w:val="3"/>
-        <w:rPr>
-          <w:color w:val="auto"/>
-        </w:rPr>
-      </w:pPr>
-      <w:r>
-        <w:rPr>
-          <w:color w:val="auto"/>
-        </w:rPr>
-        <w:t>7.2. Các ràng buộc Bean Validation (TODO 0)</w:t>
-      </w:r>
-    </w:p>
-    <w:p>
-      <w:pPr>
-        <w:rPr>
-          <w:color w:val="auto"/>
-        </w:rPr>
-      </w:pPr>
-      <w:r>
-        <w:rPr>
-          <w:color w:val="auto"/>
-        </w:rPr>
-        <w:t>• @NotBlank: fullName, studentCode, major, email</w:t>
-      </w:r>
-    </w:p>
-    <w:p>
-      <w:pPr>
-        <w:rPr>
-          <w:color w:val="auto"/>
-        </w:rPr>
-      </w:pPr>
-      <w:r>
-        <w:rPr>
-          <w:color w:val="auto"/>
-        </w:rPr>
-        <w:t>• @Size(max = 100): giới hạn độ dài họ tên; @Size(max = 10): mã ngành học</w:t>
-      </w:r>
-    </w:p>
-    <w:p>
-      <w:pPr>
-        <w:rPr>
-          <w:color w:val="auto"/>
-        </w:rPr>
-      </w:pPr>
-      <w:r>
-        <w:rPr>
-          <w:color w:val="auto"/>
-        </w:rPr>
-        <w:t>• @Email: đảm bảo định dạng hộp thư điện tử hợp lệ</w:t>
-      </w:r>
-    </w:p>
-    <w:p>
-      <w:pPr>
-        <w:rPr>
-          <w:color w:val="auto"/>
-        </w:rPr>
-      </w:pPr>
-      <w:r>
-        <w:rPr>
-          <w:color w:val="auto"/>
-        </w:rPr>
-        <w:t>• @Pattern(regexp = "^[A-Z]{2}\d{6}$"): mã sinh viên đúng định dạng 2 chữ in hoa và 6 chữ số (VD: SE180001)</w:t>
-      </w:r>
-    </w:p>
-    <w:p>
-      <w:pPr>
-        <w:rPr>
-          <w:color w:val="auto"/>
-        </w:rPr>
-      </w:pPr>
-      <w:r>
-        <w:rPr>
-          <w:color w:val="auto"/>
-        </w:rPr>
-        <w:t>• @DecimalMin("0.0") và @DecimalMax("10.0"): điểm trung bình GPA trong thang điểm 10</w:t>
-      </w:r>
-    </w:p>
-    <w:p>
-      <w:pPr>
-        <w:rPr>
-          <w:color w:val="auto"/>
-        </w:rPr>
-      </w:pPr>
-      <w:r>
-        <w:rPr>
-          <w:color w:val="auto"/>
-        </w:rPr>
-        <w:t>• @NotNull kết hợp @Past: ngày sinh phải là ngày trong quá khứ</w:t>
-      </w:r>
-    </w:p>
-    <w:p>
-      <w:pPr>
-        <w:pStyle w:val="3"/>
-        <w:rPr>
-          <w:color w:val="auto"/>
-        </w:rPr>
-      </w:pPr>
-      <w:r>
-        <w:rPr>
-          <w:color w:val="auto"/>
-        </w:rPr>
-        <w:t>7.3. Computed Properties – Thuộc tính tính toán (TODO 3)</w:t>
-      </w:r>
-    </w:p>
-    <w:p>
-      <w:r>
-        <w:t>• getAge(): Tính tuổi tự động bằng ChronoUnit.YEARS giữa dateOfBirth và ngày hiện tại. Không lưu trữ thành cột trong CSDL.</w:t>
-      </w:r>
-    </w:p>
-    <w:p>
-      <w:r>
-        <w:t>• getRank(): Tự động xếp loại học lực dựa theo GPA: Xuất sắc (&gt;= 9.0), Giỏi (&gt;= 8.0), Khá (&gt;= 6.5), Trung bình (&gt;= 5.0), Yếu (&lt; 5.0).</w:t>
-      </w:r>
-    </w:p>
-    <w:p>
-      <w:pPr>
-        <w:jc w:val="center"/>
-      </w:pPr>
-      <w:r>
-        <w:drawing>
-          <wp:inline distT="0" distB="0" distL="114300" distR="114300">
-            <wp:extent cx="5265420" cy="2959100"/>
-            <wp:effectExtent l="0" t="0" r="11430" b="12700"/>
-            <wp:docPr id="3" name="Picture 3"/>
-            <wp:cNvGraphicFramePr>
-              <a:graphicFrameLocks xmlns:a="http://schemas.openxmlformats.org/drawingml/2006/main" noChangeAspect="1"/>
-            </wp:cNvGraphicFramePr>
-            <a:graphic xmlns:a="http://schemas.openxmlformats.org/drawingml/2006/main">
-              <a:graphicData uri="http://schemas.openxmlformats.org/drawingml/2006/picture">
-                <pic:pic xmlns:pic="http://schemas.openxmlformats.org/drawingml/2006/picture">
-                  <pic:nvPicPr>
-                    <pic:cNvPr id="3" name="Picture 3"/>
-                    <pic:cNvPicPr>
-                      <a:picLocks noChangeAspect="1"/>
-                    </pic:cNvPicPr>
-                  </pic:nvPicPr>
-                  <pic:blipFill>
-                    <a:blip r:embed="rId9"/>
                     <a:stretch>
                       <a:fillRect/>
                     </a:stretch>
@@ -1364,6 +1126,8 @@
           </wp:inline>
         </w:drawing>
       </w:r>
+      <w:bookmarkStart w:id="0" w:name="_GoBack"/>
+      <w:bookmarkEnd w:id="0"/>
     </w:p>
     <w:p>
       <w:pPr>
@@ -1376,17 +1140,12 @@
         <w:rPr>
           <w:color w:val="auto"/>
         </w:rPr>
-        <w:t>8. Bước 6 – Xây Dựng StudentRepository Với Derived Query (TODO 6)</w:t>
-      </w:r>
-    </w:p>
-    <w:p>
-      <w:r>
-        <w:t>File nguồn: src/main/java/com/hsf302/student/repository/StudentRepository.java</w:t>
-      </w:r>
-    </w:p>
-    <w:p>
-      <w:r>
-        <w:t>Khai báo interface mở rộng JpaRepository&lt;Student, Long&gt; với các phương thức Derived Query tự động sinh câu truy vấn SQL:</w:t>
+        <w:t>6. Bước 4 – Kiểm Tra Biên Dịch Ứng Dụng (mvn clean compile)</w:t>
+      </w:r>
+    </w:p>
+    <w:p>
+      <w:r>
+        <w:t>Thực hiện lệnh build trên Terminal để đảm bảo mã nguồn và các thư viện trong pom.xml không xảy ra xung đột:</w:t>
       </w:r>
     </w:p>
     <w:p>
@@ -1400,119 +1159,10 @@
           <w:color w:val="333333"/>
           <w:sz w:val="21"/>
         </w:rPr>
-        <w:t>public interface StudentRepository extends JpaRepository&lt;Student, Long&gt; {</w:t>
-      </w:r>
-    </w:p>
-    <w:p>
-      <w:pPr>
-        <w:shd w:val="clear" w:fill="F2F2F2"/>
-        <w:ind w:left="360"/>
-      </w:pPr>
-      <w:r>
-        <w:rPr>
-          <w:rFonts w:ascii="Consolas" w:hAnsi="Consolas"/>
-          <w:color w:val="333333"/>
-          <w:sz w:val="21"/>
-        </w:rPr>
-        <w:t xml:space="preserve">    // Tìm kiếm không phân biệt hoa thường theo họ tên hoặc mã sinh viên</w:t>
-      </w:r>
-    </w:p>
-    <w:p>
-      <w:pPr>
-        <w:shd w:val="clear" w:fill="F2F2F2"/>
-        <w:ind w:left="360"/>
-      </w:pPr>
-      <w:r>
-        <w:rPr>
-          <w:rFonts w:ascii="Consolas" w:hAnsi="Consolas"/>
-          <w:color w:val="333333"/>
-          <w:sz w:val="21"/>
-        </w:rPr>
-        <w:t xml:space="preserve">    List&lt;Student&gt; findByFullNameContainingIgnoreCaseOrStudentCodeContainingIgnoreCase(String name, String code);</w:t>
-      </w:r>
-    </w:p>
-    <w:p>
-      <w:pPr>
-        <w:shd w:val="clear" w:fill="F2F2F2"/>
-        <w:ind w:left="360"/>
-      </w:pPr>
-    </w:p>
-    <w:p>
-      <w:pPr>
-        <w:shd w:val="clear" w:fill="F2F2F2"/>
-        <w:ind w:left="360"/>
-      </w:pPr>
-      <w:r>
-        <w:rPr>
-          <w:rFonts w:ascii="Consolas" w:hAnsi="Consolas"/>
-          <w:color w:val="333333"/>
-          <w:sz w:val="21"/>
-        </w:rPr>
-        <w:t xml:space="preserve">    // Kiểm tra trùng lặp email khi cập nhật (loại trừ ID hiện tại)</w:t>
-      </w:r>
-    </w:p>
-    <w:p>
-      <w:pPr>
-        <w:shd w:val="clear" w:fill="F2F2F2"/>
-        <w:ind w:left="360"/>
-      </w:pPr>
-      <w:r>
-        <w:rPr>
-          <w:rFonts w:ascii="Consolas" w:hAnsi="Consolas"/>
-          <w:color w:val="333333"/>
-          <w:sz w:val="21"/>
-        </w:rPr>
-        <w:t xml:space="preserve">    boolean existsByEmailAndIdNot(String email, Long id);</w:t>
-      </w:r>
-    </w:p>
-    <w:p>
-      <w:pPr>
-        <w:shd w:val="clear" w:fill="F2F2F2"/>
-        <w:ind w:left="360"/>
-      </w:pPr>
-    </w:p>
-    <w:p>
-      <w:pPr>
-        <w:shd w:val="clear" w:fill="F2F2F2"/>
-        <w:ind w:left="360"/>
-      </w:pPr>
-      <w:r>
-        <w:rPr>
-          <w:rFonts w:ascii="Consolas" w:hAnsi="Consolas"/>
-          <w:color w:val="333333"/>
-          <w:sz w:val="21"/>
-        </w:rPr>
-        <w:t xml:space="preserve">    // Kiểm tra trùng lặp mã sinh viên khi cập nhật</w:t>
-      </w:r>
-    </w:p>
-    <w:p>
-      <w:pPr>
-        <w:shd w:val="clear" w:fill="F2F2F2"/>
-        <w:ind w:left="360"/>
-      </w:pPr>
-      <w:r>
-        <w:rPr>
-          <w:rFonts w:ascii="Consolas" w:hAnsi="Consolas"/>
-          <w:color w:val="333333"/>
-          <w:sz w:val="21"/>
-        </w:rPr>
-        <w:t xml:space="preserve">    boolean existsByStudentCodeAndIdNot(String studentCode, Long id);</w:t>
-      </w:r>
-    </w:p>
-    <w:p>
-      <w:pPr>
-        <w:shd w:val="clear" w:fill="F2F2F2"/>
-        <w:ind w:left="360"/>
-      </w:pPr>
-      <w:r>
-        <w:rPr>
-          <w:rFonts w:ascii="Consolas" w:hAnsi="Consolas"/>
-          <w:color w:val="333333"/>
-          <w:sz w:val="21"/>
-        </w:rPr>
-        <w:t>}</w:t>
-      </w:r>
-    </w:p>
+        <w:t>mvn clean compile</w:t>
+      </w:r>
+    </w:p>
+    <w:p/>
     <w:p>
       <w:pPr>
         <w:jc w:val="center"/>
@@ -1520,9 +1170,9 @@
       <w:r>
         <w:drawing>
           <wp:inline distT="0" distB="0" distL="114300" distR="114300">
-            <wp:extent cx="5265420" cy="2959100"/>
-            <wp:effectExtent l="0" t="0" r="11430" b="12700"/>
-            <wp:docPr id="4" name="Picture 4"/>
+            <wp:extent cx="5039995" cy="559435"/>
+            <wp:effectExtent l="0" t="0" r="0" b="0"/>
+            <wp:docPr id="5578" name="build-success"/>
             <wp:cNvGraphicFramePr>
               <a:graphicFrameLocks xmlns:a="http://schemas.openxmlformats.org/drawingml/2006/main" noChangeAspect="1"/>
             </wp:cNvGraphicFramePr>
@@ -1530,7 +1180,217 @@
               <a:graphicData uri="http://schemas.openxmlformats.org/drawingml/2006/picture">
                 <pic:pic xmlns:pic="http://schemas.openxmlformats.org/drawingml/2006/picture">
                   <pic:nvPicPr>
-                    <pic:cNvPr id="4" name="Picture 4"/>
+                    <pic:cNvPr id="5578" name="build-success"/>
+                    <pic:cNvPicPr>
+                      <a:picLocks noChangeAspect="1"/>
+                    </pic:cNvPicPr>
+                  </pic:nvPicPr>
+                  <pic:blipFill>
+                    <a:blip r:embed="rId9"/>
+                    <a:stretch>
+                      <a:fillRect/>
+                    </a:stretch>
+                  </pic:blipFill>
+                  <pic:spPr>
+                    <a:xfrm>
+                      <a:off x="0" y="0"/>
+                      <a:ext cx="5040000" cy="560000"/>
+                    </a:xfrm>
+                    <a:prstGeom prst="rect">
+                      <a:avLst/>
+                    </a:prstGeom>
+                  </pic:spPr>
+                </pic:pic>
+              </a:graphicData>
+            </a:graphic>
+          </wp:inline>
+        </w:drawing>
+      </w:r>
+    </w:p>
+    <w:p>
+      <w:pPr>
+        <w:jc w:val="center"/>
+      </w:pPr>
+      <w:r>
+        <w:rPr>
+          <w:i/>
+          <w:color w:val="555555"/>
+        </w:rPr>
+        <w:t>Hình 6.1 – Kết quả kiểm tra biên dịch đạt BUILD SUCCESS</w:t>
+      </w:r>
+    </w:p>
+    <w:p>
+      <w:pPr>
+        <w:pStyle w:val="2"/>
+        <w:rPr>
+          <w:color w:val="auto"/>
+        </w:rPr>
+      </w:pPr>
+      <w:r>
+        <w:rPr>
+          <w:color w:val="auto"/>
+        </w:rPr>
+        <w:t>7. Bước 5 – Xây Dựng JPA Entity Student và Validation (TODO 0–3)</w:t>
+      </w:r>
+    </w:p>
+    <w:p>
+      <w:pPr>
+        <w:pStyle w:val="3"/>
+        <w:rPr>
+          <w:color w:val="auto"/>
+        </w:rPr>
+      </w:pPr>
+      <w:r>
+        <w:rPr>
+          <w:color w:val="auto"/>
+        </w:rPr>
+        <w:t>7.1. Định nghĩa Entity JPA và Ánh xạ Bảng CSDL</w:t>
+      </w:r>
+    </w:p>
+    <w:p>
+      <w:r>
+        <w:t>File nguồn: src/main/java/com/hsf302/student/entity/Student.java</w:t>
+      </w:r>
+    </w:p>
+    <w:p>
+      <w:r>
+        <w:t>Sử dụng các annotation JPA: @Entity, @Table(name = "students"), @Id, @GeneratedValue(strategy = GenerationType.IDENTITY), @Column.</w:t>
+      </w:r>
+    </w:p>
+    <w:p>
+      <w:pPr>
+        <w:pStyle w:val="3"/>
+        <w:rPr>
+          <w:color w:val="auto"/>
+        </w:rPr>
+      </w:pPr>
+      <w:r>
+        <w:rPr>
+          <w:color w:val="auto"/>
+        </w:rPr>
+        <w:t>7.2. Các ràng buộc Bean Validation (TODO 0)</w:t>
+      </w:r>
+    </w:p>
+    <w:p>
+      <w:pPr>
+        <w:rPr>
+          <w:color w:val="auto"/>
+        </w:rPr>
+      </w:pPr>
+      <w:r>
+        <w:rPr>
+          <w:color w:val="auto"/>
+        </w:rPr>
+        <w:t>• @NotBlank: fullName, studentCode, major, email</w:t>
+      </w:r>
+    </w:p>
+    <w:p>
+      <w:pPr>
+        <w:rPr>
+          <w:color w:val="auto"/>
+        </w:rPr>
+      </w:pPr>
+      <w:r>
+        <w:rPr>
+          <w:color w:val="auto"/>
+        </w:rPr>
+        <w:t>• @Size(max = 100): giới hạn độ dài họ tên; @Size(max = 10): mã ngành học</w:t>
+      </w:r>
+    </w:p>
+    <w:p>
+      <w:pPr>
+        <w:rPr>
+          <w:color w:val="auto"/>
+        </w:rPr>
+      </w:pPr>
+      <w:r>
+        <w:rPr>
+          <w:color w:val="auto"/>
+        </w:rPr>
+        <w:t>• @Email: đảm bảo định dạng hộp thư điện tử hợp lệ</w:t>
+      </w:r>
+    </w:p>
+    <w:p>
+      <w:pPr>
+        <w:rPr>
+          <w:color w:val="auto"/>
+        </w:rPr>
+      </w:pPr>
+      <w:r>
+        <w:rPr>
+          <w:color w:val="auto"/>
+        </w:rPr>
+        <w:t>• @Pattern(regexp = "^[A-Z]{2}\d{6}$"): mã sinh viên đúng định dạng 2 chữ in hoa và 6 chữ số (VD: SE180001)</w:t>
+      </w:r>
+    </w:p>
+    <w:p>
+      <w:pPr>
+        <w:rPr>
+          <w:color w:val="auto"/>
+        </w:rPr>
+      </w:pPr>
+      <w:r>
+        <w:rPr>
+          <w:color w:val="auto"/>
+        </w:rPr>
+        <w:t>• @DecimalMin("0.0") và @DecimalMax("10.0"): điểm trung bình GPA trong thang điểm 10</w:t>
+      </w:r>
+    </w:p>
+    <w:p>
+      <w:pPr>
+        <w:rPr>
+          <w:color w:val="auto"/>
+        </w:rPr>
+      </w:pPr>
+      <w:r>
+        <w:rPr>
+          <w:color w:val="auto"/>
+        </w:rPr>
+        <w:t>• @NotNull kết hợp @Past: ngày sinh phải là ngày trong quá khứ</w:t>
+      </w:r>
+    </w:p>
+    <w:p>
+      <w:pPr>
+        <w:pStyle w:val="3"/>
+        <w:rPr>
+          <w:color w:val="auto"/>
+        </w:rPr>
+      </w:pPr>
+      <w:r>
+        <w:rPr>
+          <w:color w:val="auto"/>
+        </w:rPr>
+        <w:t>7.3. Computed Properties – Thuộc tính tính toán (TODO 3)</w:t>
+      </w:r>
+    </w:p>
+    <w:p>
+      <w:r>
+        <w:t>• getAge(): Tính tuổi tự động bằng ChronoUnit.YEARS giữa dateOfBirth và ngày hiện tại. Không lưu trữ thành cột trong CSDL.</w:t>
+      </w:r>
+    </w:p>
+    <w:p>
+      <w:r>
+        <w:t>• getRank(): Tự động xếp loại học lực dựa theo GPA: Xuất sắc (&gt;= 9.0), Giỏi (&gt;= 8.0), Khá (&gt;= 6.5), Trung bình (&gt;= 5.0), Yếu (&lt; 5.0).</w:t>
+      </w:r>
+    </w:p>
+    <w:p>
+      <w:pPr>
+        <w:jc w:val="center"/>
+      </w:pPr>
+      <w:r>
+        <w:drawing>
+          <wp:inline distT="0" distB="0" distL="114300" distR="114300">
+            <wp:extent cx="5265420" cy="2959100"/>
+            <wp:effectExtent l="0" t="0" r="11430" b="12700"/>
+            <wp:docPr id="3" name="Picture 3"/>
+            <wp:cNvGraphicFramePr>
+              <a:graphicFrameLocks xmlns:a="http://schemas.openxmlformats.org/drawingml/2006/main" noChangeAspect="1"/>
+            </wp:cNvGraphicFramePr>
+            <a:graphic xmlns:a="http://schemas.openxmlformats.org/drawingml/2006/main">
+              <a:graphicData uri="http://schemas.openxmlformats.org/drawingml/2006/picture">
+                <pic:pic xmlns:pic="http://schemas.openxmlformats.org/drawingml/2006/picture">
+                  <pic:nvPicPr>
+                    <pic:cNvPr id="3" name="Picture 3"/>
                     <pic:cNvPicPr>
                       <a:picLocks noChangeAspect="1"/>
                     </pic:cNvPicPr>
@@ -1572,128 +1432,143 @@
         <w:rPr>
           <w:color w:val="auto"/>
         </w:rPr>
-        <w:t>9. Bước 7 – Xây Dựng StudentService và DataInitializer (TODO 7)</w:t>
-      </w:r>
-    </w:p>
-    <w:p>
-      <w:pPr>
-        <w:pStyle w:val="3"/>
-        <w:rPr>
-          <w:color w:val="auto"/>
-        </w:rPr>
-      </w:pPr>
-      <w:r>
-        <w:rPr>
-          <w:color w:val="auto"/>
-        </w:rPr>
-        <w:t>9.1. Lớp StudentService</w:t>
-      </w:r>
-    </w:p>
-    <w:p>
-      <w:r>
-        <w:t>File nguồn: src/main/java/com/hsf302/student/service/StudentService.java</w:t>
-      </w:r>
-    </w:p>
-    <w:p>
-      <w:r>
-        <w:t>Cung cấp các nghiệp vụ: findAll(), search(keyword), findById(id), save(student), delete(id), getAverageGpa(), countActive().</w:t>
-      </w:r>
-    </w:p>
-    <w:p>
-      <w:pPr>
-        <w:pStyle w:val="3"/>
-        <w:rPr>
-          <w:color w:val="auto"/>
-        </w:rPr>
-      </w:pPr>
-      <w:r>
-        <w:rPr>
-          <w:color w:val="auto"/>
-        </w:rPr>
-        <w:t>9.2. Nạp dữ liệu mẫu tự động với DataInitializer</w:t>
-      </w:r>
-    </w:p>
-    <w:p>
-      <w:pPr>
-        <w:rPr>
-          <w:color w:val="auto"/>
-        </w:rPr>
-      </w:pPr>
-      <w:r>
-        <w:rPr>
-          <w:color w:val="auto"/>
-        </w:rPr>
-        <w:t>File nguồn: src/main/java/com/hsf302/student/config/DataInitializer.java</w:t>
-      </w:r>
-    </w:p>
-    <w:p>
-      <w:pPr>
-        <w:rPr>
-          <w:color w:val="auto"/>
-        </w:rPr>
-      </w:pPr>
-      <w:r>
-        <w:rPr>
-          <w:color w:val="auto"/>
-        </w:rPr>
-        <w:t>Thực thi CommandLineRunner để khởi tạo 5 bản ghi sinh viên mẫu ban đầu khi CSDL chưa có dữ liệu, phục vụ cho việc kiểm thử xếp loại, màu sắc cảnh báo và tính toán điểm trung bình.</w:t>
-      </w:r>
-    </w:p>
-    <w:p>
-      <w:pPr>
-        <w:pStyle w:val="2"/>
-        <w:rPr>
-          <w:color w:val="auto"/>
-        </w:rPr>
-      </w:pPr>
-      <w:r>
-        <w:rPr>
-          <w:color w:val="auto"/>
-        </w:rPr>
-        <w:t>10. Bước 8 – Xây Dựng StudentController (TODO 4–7)</w:t>
-      </w:r>
-    </w:p>
-    <w:p>
-      <w:r>
-        <w:t>File nguồn: src/main/java/com/hsf302/student/controller/StudentController.java</w:t>
-      </w:r>
-    </w:p>
-    <w:p>
-      <w:r>
-        <w:t>Các endpoint được cài đặt đầy đủ theo chuẩn Spring MVC:</w:t>
-      </w:r>
-    </w:p>
-    <w:p>
-      <w:r>
-        <w:t>• GET  /students           : Trang hiển thị danh sách, hỗ trợ tìm kiếm qua request param ?keyword=...</w:t>
-      </w:r>
-    </w:p>
-    <w:p>
-      <w:r>
-        <w:t>• GET  /students/{id}      : Xem chi tiết thông tin một sinh viên.</w:t>
-      </w:r>
-    </w:p>
-    <w:p>
-      <w:r>
-        <w:t>• GET  /students/new       : Hiển thị form thêm mới sinh viên.</w:t>
-      </w:r>
-    </w:p>
-    <w:p>
-      <w:r>
-        <w:t>• GET  /students/{id}/edit : Hiển thị form cập nhật dữ liệu sinh viên có sẵn.</w:t>
-      </w:r>
-    </w:p>
-    <w:p>
-      <w:r>
-        <w:t>• POST /students/save      : Lưu dữ liệu thêm mới/sửa với @Valid, BindingResult kiểm tra lỗi và RedirectAttributes gửi flash message.</w:t>
-      </w:r>
-    </w:p>
-    <w:p>
-      <w:r>
-        <w:t>• POST /students/{id}/delete : Xóa bản ghi sinh viên và chuyển hướng về trang danh sách.</w:t>
-      </w:r>
-    </w:p>
-    <w:p/>
+        <w:t>8. Bước 6 – Xây Dựng StudentRepository Với Derived Query (TODO 6)</w:t>
+      </w:r>
+    </w:p>
+    <w:p>
+      <w:r>
+        <w:t>File nguồn: src/main/java/com/hsf302/student/repository/StudentRepository.java</w:t>
+      </w:r>
+    </w:p>
+    <w:p>
+      <w:r>
+        <w:t>Khai báo interface mở rộng JpaRepository&lt;Student, Long&gt; với các phương thức Derived Query tự động sinh câu truy vấn SQL:</w:t>
+      </w:r>
+    </w:p>
+    <w:p>
+      <w:pPr>
+        <w:shd w:val="clear" w:fill="F2F2F2"/>
+        <w:ind w:left="360"/>
+      </w:pPr>
+      <w:r>
+        <w:rPr>
+          <w:rFonts w:ascii="Consolas" w:hAnsi="Consolas"/>
+          <w:color w:val="333333"/>
+          <w:sz w:val="21"/>
+        </w:rPr>
+        <w:t>public interface StudentRepository extends JpaRepository&lt;Student, Long&gt; {</w:t>
+      </w:r>
+    </w:p>
+    <w:p>
+      <w:pPr>
+        <w:shd w:val="clear" w:fill="F2F2F2"/>
+        <w:ind w:left="360"/>
+      </w:pPr>
+      <w:r>
+        <w:rPr>
+          <w:rFonts w:ascii="Consolas" w:hAnsi="Consolas"/>
+          <w:color w:val="333333"/>
+          <w:sz w:val="21"/>
+        </w:rPr>
+        <w:t xml:space="preserve">    // Tìm kiếm không phân biệt hoa thường theo họ tên hoặc mã sinh viên</w:t>
+      </w:r>
+    </w:p>
+    <w:p>
+      <w:pPr>
+        <w:shd w:val="clear" w:fill="F2F2F2"/>
+        <w:ind w:left="360"/>
+      </w:pPr>
+      <w:r>
+        <w:rPr>
+          <w:rFonts w:ascii="Consolas" w:hAnsi="Consolas"/>
+          <w:color w:val="333333"/>
+          <w:sz w:val="21"/>
+        </w:rPr>
+        <w:t xml:space="preserve">    List&lt;Student&gt; findByFullNameContainingIgnoreCaseOrStudentCodeContainingIgnoreCase(String name, String code);</w:t>
+      </w:r>
+    </w:p>
+    <w:p>
+      <w:pPr>
+        <w:shd w:val="clear" w:fill="F2F2F2"/>
+        <w:ind w:left="360"/>
+      </w:pPr>
+    </w:p>
+    <w:p>
+      <w:pPr>
+        <w:shd w:val="clear" w:fill="F2F2F2"/>
+        <w:ind w:left="360"/>
+      </w:pPr>
+      <w:r>
+        <w:rPr>
+          <w:rFonts w:ascii="Consolas" w:hAnsi="Consolas"/>
+          <w:color w:val="333333"/>
+          <w:sz w:val="21"/>
+        </w:rPr>
+        <w:t xml:space="preserve">    // Kiểm tra trùng lặp email khi cập nhật (loại trừ ID hiện tại)</w:t>
+      </w:r>
+    </w:p>
+    <w:p>
+      <w:pPr>
+        <w:shd w:val="clear" w:fill="F2F2F2"/>
+        <w:ind w:left="360"/>
+      </w:pPr>
+      <w:r>
+        <w:rPr>
+          <w:rFonts w:ascii="Consolas" w:hAnsi="Consolas"/>
+          <w:color w:val="333333"/>
+          <w:sz w:val="21"/>
+        </w:rPr>
+        <w:t xml:space="preserve">    boolean existsByEmailAndIdNot(String email, Long id);</w:t>
+      </w:r>
+    </w:p>
+    <w:p>
+      <w:pPr>
+        <w:shd w:val="clear" w:fill="F2F2F2"/>
+        <w:ind w:left="360"/>
+      </w:pPr>
+    </w:p>
+    <w:p>
+      <w:pPr>
+        <w:shd w:val="clear" w:fill="F2F2F2"/>
+        <w:ind w:left="360"/>
+      </w:pPr>
+      <w:r>
+        <w:rPr>
+          <w:rFonts w:ascii="Consolas" w:hAnsi="Consolas"/>
+          <w:color w:val="333333"/>
+          <w:sz w:val="21"/>
+        </w:rPr>
+        <w:t xml:space="preserve">    // Kiểm tra trùng lặp mã sinh viên khi cập nhật</w:t>
+      </w:r>
+    </w:p>
+    <w:p>
+      <w:pPr>
+        <w:shd w:val="clear" w:fill="F2F2F2"/>
+        <w:ind w:left="360"/>
+      </w:pPr>
+      <w:r>
+        <w:rPr>
+          <w:rFonts w:ascii="Consolas" w:hAnsi="Consolas"/>
+          <w:color w:val="333333"/>
+          <w:sz w:val="21"/>
+        </w:rPr>
+        <w:t xml:space="preserve">    boolean existsByStudentCodeAndIdNot(String studentCode, Long id);</w:t>
+      </w:r>
+    </w:p>
+    <w:p>
+      <w:pPr>
+        <w:shd w:val="clear" w:fill="F2F2F2"/>
+        <w:ind w:left="360"/>
+      </w:pPr>
+      <w:r>
+        <w:rPr>
+          <w:rFonts w:ascii="Consolas" w:hAnsi="Consolas"/>
+          <w:color w:val="333333"/>
+          <w:sz w:val="21"/>
+        </w:rPr>
+        <w:t>}</w:t>
+      </w:r>
+    </w:p>
     <w:p>
       <w:pPr>
         <w:jc w:val="center"/>
@@ -1701,9 +1576,9 @@
       <w:r>
         <w:drawing>
           <wp:inline distT="0" distB="0" distL="114300" distR="114300">
-            <wp:extent cx="5039995" cy="559435"/>
-            <wp:effectExtent l="0" t="0" r="0" b="0"/>
-            <wp:docPr id="5581" name="app-started-8080"/>
+            <wp:extent cx="5265420" cy="2959100"/>
+            <wp:effectExtent l="0" t="0" r="11430" b="12700"/>
+            <wp:docPr id="4" name="Picture 4"/>
             <wp:cNvGraphicFramePr>
               <a:graphicFrameLocks xmlns:a="http://schemas.openxmlformats.org/drawingml/2006/main" noChangeAspect="1"/>
             </wp:cNvGraphicFramePr>
@@ -1711,106 +1586,13 @@
               <a:graphicData uri="http://schemas.openxmlformats.org/drawingml/2006/picture">
                 <pic:pic xmlns:pic="http://schemas.openxmlformats.org/drawingml/2006/picture">
                   <pic:nvPicPr>
-                    <pic:cNvPr id="5581" name="app-started-8080"/>
+                    <pic:cNvPr id="4" name="Picture 4"/>
                     <pic:cNvPicPr>
                       <a:picLocks noChangeAspect="1"/>
                     </pic:cNvPicPr>
                   </pic:nvPicPr>
                   <pic:blipFill>
                     <a:blip r:embed="rId11"/>
-                    <a:stretch>
-                      <a:fillRect/>
-                    </a:stretch>
-                  </pic:blipFill>
-                  <pic:spPr>
-                    <a:xfrm>
-                      <a:off x="0" y="0"/>
-                      <a:ext cx="5040000" cy="560000"/>
-                    </a:xfrm>
-                    <a:prstGeom prst="rect">
-                      <a:avLst/>
-                    </a:prstGeom>
-                  </pic:spPr>
-                </pic:pic>
-              </a:graphicData>
-            </a:graphic>
-          </wp:inline>
-        </w:drawing>
-      </w:r>
-    </w:p>
-    <w:p>
-      <w:pPr>
-        <w:pStyle w:val="2"/>
-        <w:rPr>
-          <w:color w:val="auto"/>
-        </w:rPr>
-      </w:pPr>
-      <w:r>
-        <w:rPr>
-          <w:color w:val="auto"/>
-        </w:rPr>
-        <w:t>11. Bước 9 – Xây Dựng Layout Chung main.html (TODO 8)</w:t>
-      </w:r>
-    </w:p>
-    <w:p>
-      <w:r>
-        <w:t>File nguồn: src/main/resources/templates/layout/main.html</w:t>
-      </w:r>
-    </w:p>
-    <w:p>
-      <w:r>
-        <w:t>Sử dụng Thymeleaf Layout Dialect để xây dựng layout chuẩn, áp dụng chung cho toàn bộ các trang con:</w:t>
-      </w:r>
-    </w:p>
-    <w:p>
-      <w:r>
-        <w:t>• xmlns:layout="http://www.ultraq.net.nz/thymeleaf/layout"</w:t>
-      </w:r>
-    </w:p>
-    <w:p>
-      <w:r>
-        <w:t>• &lt;title layout:title-pattern="$LAYOUT_TITLE | $CONTENT_TITLE"&gt;: tự động ghép tiêu đề trang.</w:t>
-      </w:r>
-    </w:p>
-    <w:p>
-      <w:r>
-        <w:t>• Navbar tích hợp hiệu ứng active theo URL hiện tại: th:classappend="${currentUri eq '/students'} ? 'active'".</w:t>
-      </w:r>
-    </w:p>
-    <w:p>
-      <w:r>
-        <w:t>• Khối hiển thị Flash Message tự động (thành công / cảnh báo lỗi) thông qua th:if="${successMsg}".</w:t>
-      </w:r>
-    </w:p>
-    <w:p>
-      <w:r>
-        <w:t>• &lt;div layout:fragment="content"&gt;: vùng nội dung để các trang con chèn giao diện.</w:t>
-      </w:r>
-    </w:p>
-    <w:p>
-      <w:pPr>
-        <w:jc w:val="center"/>
-      </w:pPr>
-      <w:r>
-        <w:drawing>
-          <wp:inline distT="0" distB="0" distL="114300" distR="114300">
-            <wp:extent cx="5265420" cy="2959100"/>
-            <wp:effectExtent l="0" t="0" r="11430" b="12700"/>
-            <wp:docPr id="5" name="Picture 5"/>
-            <wp:cNvGraphicFramePr>
-              <a:graphicFrameLocks xmlns:a="http://schemas.openxmlformats.org/drawingml/2006/main" noChangeAspect="1"/>
-            </wp:cNvGraphicFramePr>
-            <a:graphic xmlns:a="http://schemas.openxmlformats.org/drawingml/2006/main">
-              <a:graphicData uri="http://schemas.openxmlformats.org/drawingml/2006/picture">
-                <pic:pic xmlns:pic="http://schemas.openxmlformats.org/drawingml/2006/picture">
-                  <pic:nvPicPr>
-                    <pic:cNvPr id="5" name="Picture 5"/>
-                    <pic:cNvPicPr>
-                      <a:picLocks noChangeAspect="1"/>
-                    </pic:cNvPicPr>
-                  </pic:nvPicPr>
-                  <pic:blipFill>
-                    <a:blip r:embed="rId12"/>
                     <a:stretch>
                       <a:fillRect/>
                     </a:stretch>
@@ -1834,6 +1616,280 @@
           </wp:inline>
         </w:drawing>
       </w:r>
+    </w:p>
+    <w:p>
+      <w:pPr>
+        <w:pStyle w:val="2"/>
+        <w:rPr>
+          <w:color w:val="auto"/>
+        </w:rPr>
+      </w:pPr>
+      <w:r>
+        <w:rPr>
+          <w:color w:val="auto"/>
+        </w:rPr>
+        <w:t>9. Bước 7 – Xây Dựng StudentService và DataInitializer (TODO 7)</w:t>
+      </w:r>
+    </w:p>
+    <w:p>
+      <w:pPr>
+        <w:pStyle w:val="3"/>
+        <w:rPr>
+          <w:color w:val="auto"/>
+        </w:rPr>
+      </w:pPr>
+      <w:r>
+        <w:rPr>
+          <w:color w:val="auto"/>
+        </w:rPr>
+        <w:t>9.1. Lớp StudentService</w:t>
+      </w:r>
+    </w:p>
+    <w:p>
+      <w:r>
+        <w:t>File nguồn: src/main/java/com/hsf302/student/service/StudentService.java</w:t>
+      </w:r>
+    </w:p>
+    <w:p>
+      <w:r>
+        <w:t>Cung cấp các nghiệp vụ: findAll(), search(keyword), findById(id), save(student), delete(id), getAverageGpa(), countActive().</w:t>
+      </w:r>
+    </w:p>
+    <w:p>
+      <w:pPr>
+        <w:pStyle w:val="3"/>
+        <w:rPr>
+          <w:color w:val="auto"/>
+        </w:rPr>
+      </w:pPr>
+      <w:r>
+        <w:rPr>
+          <w:color w:val="auto"/>
+        </w:rPr>
+        <w:t>9.2. Nạp dữ liệu mẫu tự động với DataInitializer</w:t>
+      </w:r>
+    </w:p>
+    <w:p>
+      <w:pPr>
+        <w:rPr>
+          <w:color w:val="auto"/>
+        </w:rPr>
+      </w:pPr>
+      <w:r>
+        <w:rPr>
+          <w:color w:val="auto"/>
+        </w:rPr>
+        <w:t>File nguồn: src/main/java/com/hsf302/student/config/DataInitializer.java</w:t>
+      </w:r>
+    </w:p>
+    <w:p>
+      <w:pPr>
+        <w:rPr>
+          <w:color w:val="auto"/>
+        </w:rPr>
+      </w:pPr>
+      <w:r>
+        <w:rPr>
+          <w:color w:val="auto"/>
+        </w:rPr>
+        <w:t>Thực thi CommandLineRunner để khởi tạo 5 bản ghi sinh viên mẫu ban đầu khi CSDL chưa có dữ liệu, phục vụ cho việc kiểm thử xếp loại, màu sắc cảnh báo và tính toán điểm trung bình.</w:t>
+      </w:r>
+    </w:p>
+    <w:p>
+      <w:pPr>
+        <w:pStyle w:val="2"/>
+        <w:rPr>
+          <w:color w:val="auto"/>
+        </w:rPr>
+      </w:pPr>
+      <w:r>
+        <w:rPr>
+          <w:color w:val="auto"/>
+        </w:rPr>
+        <w:t>10. Bước 8 – Xây Dựng StudentController (TODO 4–7)</w:t>
+      </w:r>
+    </w:p>
+    <w:p>
+      <w:r>
+        <w:t>File nguồn: src/main/java/com/hsf302/student/controller/StudentController.java</w:t>
+      </w:r>
+    </w:p>
+    <w:p>
+      <w:r>
+        <w:t>Các endpoint được cài đặt đầy đủ theo chuẩn Spring MVC:</w:t>
+      </w:r>
+    </w:p>
+    <w:p>
+      <w:r>
+        <w:t>• GET  /students           : Trang hiển thị danh sách, hỗ trợ tìm kiếm qua request param ?keyword=...</w:t>
+      </w:r>
+    </w:p>
+    <w:p>
+      <w:r>
+        <w:t>• GET  /students/{id}      : Xem chi tiết thông tin một sinh viên.</w:t>
+      </w:r>
+    </w:p>
+    <w:p>
+      <w:r>
+        <w:t>• GET  /students/new       : Hiển thị form thêm mới sinh viên.</w:t>
+      </w:r>
+    </w:p>
+    <w:p>
+      <w:r>
+        <w:t>• GET  /students/{id}/edit : Hiển thị form cập nhật dữ liệu sinh viên có sẵn.</w:t>
+      </w:r>
+    </w:p>
+    <w:p>
+      <w:r>
+        <w:t>• POST /students/save      : Lưu dữ liệu thêm mới/sửa với @Valid, BindingResult kiểm tra lỗi và RedirectAttributes gửi flash message.</w:t>
+      </w:r>
+    </w:p>
+    <w:p>
+      <w:r>
+        <w:t>• POST /students/{id}/delete : Xóa bản ghi sinh viên và chuyển hướng về trang danh sách.</w:t>
+      </w:r>
+    </w:p>
+    <w:p/>
+    <w:p>
+      <w:pPr>
+        <w:jc w:val="center"/>
+      </w:pPr>
+      <w:r>
+        <w:drawing>
+          <wp:inline distT="0" distB="0" distL="114300" distR="114300">
+            <wp:extent cx="5039995" cy="559435"/>
+            <wp:effectExtent l="0" t="0" r="0" b="0"/>
+            <wp:docPr id="5581" name="app-started-8080"/>
+            <wp:cNvGraphicFramePr>
+              <a:graphicFrameLocks xmlns:a="http://schemas.openxmlformats.org/drawingml/2006/main" noChangeAspect="1"/>
+            </wp:cNvGraphicFramePr>
+            <a:graphic xmlns:a="http://schemas.openxmlformats.org/drawingml/2006/main">
+              <a:graphicData uri="http://schemas.openxmlformats.org/drawingml/2006/picture">
+                <pic:pic xmlns:pic="http://schemas.openxmlformats.org/drawingml/2006/picture">
+                  <pic:nvPicPr>
+                    <pic:cNvPr id="5581" name="app-started-8080"/>
+                    <pic:cNvPicPr>
+                      <a:picLocks noChangeAspect="1"/>
+                    </pic:cNvPicPr>
+                  </pic:nvPicPr>
+                  <pic:blipFill>
+                    <a:blip r:embed="rId12"/>
+                    <a:stretch>
+                      <a:fillRect/>
+                    </a:stretch>
+                  </pic:blipFill>
+                  <pic:spPr>
+                    <a:xfrm>
+                      <a:off x="0" y="0"/>
+                      <a:ext cx="5040000" cy="560000"/>
+                    </a:xfrm>
+                    <a:prstGeom prst="rect">
+                      <a:avLst/>
+                    </a:prstGeom>
+                  </pic:spPr>
+                </pic:pic>
+              </a:graphicData>
+            </a:graphic>
+          </wp:inline>
+        </w:drawing>
+      </w:r>
+    </w:p>
+    <w:p>
+      <w:pPr>
+        <w:pStyle w:val="2"/>
+        <w:rPr>
+          <w:color w:val="auto"/>
+        </w:rPr>
+      </w:pPr>
+      <w:r>
+        <w:rPr>
+          <w:color w:val="auto"/>
+        </w:rPr>
+        <w:t>11. Bước 9 – Xây Dựng Layout Chung main.html (TODO 8)</w:t>
+      </w:r>
+    </w:p>
+    <w:p>
+      <w:r>
+        <w:t>File nguồn: src/main/resources/templates/layout/main.html</w:t>
+      </w:r>
+    </w:p>
+    <w:p>
+      <w:r>
+        <w:t>Sử dụng Thymeleaf Layout Dialect để xây dựng layout chuẩn, áp dụng chung cho toàn bộ các trang con:</w:t>
+      </w:r>
+    </w:p>
+    <w:p>
+      <w:r>
+        <w:t>• xmlns:layout="http://www.ultraq.net.nz/thymeleaf/layout"</w:t>
+      </w:r>
+    </w:p>
+    <w:p>
+      <w:r>
+        <w:t>• &lt;title layout:title-pattern="$LAYOUT_TITLE | $CONTENT_TITLE"&gt;: tự động ghép tiêu đề trang.</w:t>
+      </w:r>
+    </w:p>
+    <w:p>
+      <w:r>
+        <w:t>• Navbar tích hợp hiệu ứng active theo URL hiện tại: th:classappend="${currentUri eq '/students'} ? 'active'".</w:t>
+      </w:r>
+    </w:p>
+    <w:p>
+      <w:r>
+        <w:t>• Khối hiển thị Flash Message tự động (thành công / cảnh báo lỗi) thông qua th:if="${successMsg}".</w:t>
+      </w:r>
+    </w:p>
+    <w:p>
+      <w:r>
+        <w:t>• &lt;div layout:fragment="content"&gt;: vùng nội dung để các trang con chèn giao diện.</w:t>
+      </w:r>
+    </w:p>
+    <w:p>
+      <w:pPr>
+        <w:jc w:val="center"/>
+      </w:pPr>
+      <w:r>
+        <w:drawing>
+          <wp:inline distT="0" distB="0" distL="114300" distR="114300">
+            <wp:extent cx="5265420" cy="2959100"/>
+            <wp:effectExtent l="0" t="0" r="11430" b="12700"/>
+            <wp:docPr id="5" name="Picture 5"/>
+            <wp:cNvGraphicFramePr>
+              <a:graphicFrameLocks xmlns:a="http://schemas.openxmlformats.org/drawingml/2006/main" noChangeAspect="1"/>
+            </wp:cNvGraphicFramePr>
+            <a:graphic xmlns:a="http://schemas.openxmlformats.org/drawingml/2006/main">
+              <a:graphicData uri="http://schemas.openxmlformats.org/drawingml/2006/picture">
+                <pic:pic xmlns:pic="http://schemas.openxmlformats.org/drawingml/2006/picture">
+                  <pic:nvPicPr>
+                    <pic:cNvPr id="5" name="Picture 5"/>
+                    <pic:cNvPicPr>
+                      <a:picLocks noChangeAspect="1"/>
+                    </pic:cNvPicPr>
+                  </pic:nvPicPr>
+                  <pic:blipFill>
+                    <a:blip r:embed="rId13"/>
+                    <a:stretch>
+                      <a:fillRect/>
+                    </a:stretch>
+                  </pic:blipFill>
+                  <pic:spPr>
+                    <a:xfrm>
+                      <a:off x="0" y="0"/>
+                      <a:ext cx="5265420" cy="2959100"/>
+                    </a:xfrm>
+                    <a:prstGeom prst="rect">
+                      <a:avLst/>
+                    </a:prstGeom>
+                    <a:noFill/>
+                    <a:ln>
+                      <a:noFill/>
+                    </a:ln>
+                  </pic:spPr>
+                </pic:pic>
+              </a:graphicData>
+            </a:graphic>
+          </wp:inline>
+        </w:drawing>
+      </w:r>
       <w:r>
         <w:rPr>
           <w:i/>
@@ -1980,7 +2036,7 @@
                     </pic:cNvPicPr>
                   </pic:nvPicPr>
                   <pic:blipFill>
-                    <a:blip r:embed="rId13"/>
+                    <a:blip r:embed="rId14"/>
                     <a:stretch>
                       <a:fillRect/>
                     </a:stretch>
@@ -2037,7 +2093,7 @@
                     </pic:cNvPicPr>
                   </pic:nvPicPr>
                   <pic:blipFill>
-                    <a:blip r:embed="rId14"/>
+                    <a:blip r:embed="rId15"/>
                     <a:stretch>
                       <a:fillRect/>
                     </a:stretch>
@@ -2136,188 +2192,6 @@
                 <pic:pic xmlns:pic="http://schemas.openxmlformats.org/drawingml/2006/picture">
                   <pic:nvPicPr>
                     <pic:cNvPr id="7" name="Picture 7"/>
-                    <pic:cNvPicPr>
-                      <a:picLocks noChangeAspect="1"/>
-                    </pic:cNvPicPr>
-                  </pic:nvPicPr>
-                  <pic:blipFill>
-                    <a:blip r:embed="rId15"/>
-                    <a:stretch>
-                      <a:fillRect/>
-                    </a:stretch>
-                  </pic:blipFill>
-                  <pic:spPr>
-                    <a:xfrm>
-                      <a:off x="0" y="0"/>
-                      <a:ext cx="5265420" cy="2959100"/>
-                    </a:xfrm>
-                    <a:prstGeom prst="rect">
-                      <a:avLst/>
-                    </a:prstGeom>
-                    <a:noFill/>
-                    <a:ln>
-                      <a:noFill/>
-                    </a:ln>
-                  </pic:spPr>
-                </pic:pic>
-              </a:graphicData>
-            </a:graphic>
-          </wp:inline>
-        </w:drawing>
-      </w:r>
-      <w:r>
-        <w:rPr>
-          <w:i/>
-          <w:color w:val="555555"/>
-        </w:rPr>
-        <w:t>Hình 13.1 – Trang chi tiết sinh viên hiển thị thông tin, học bổng và tuổi tự động</w:t>
-      </w:r>
-    </w:p>
-    <w:p>
-      <w:pPr>
-        <w:pStyle w:val="2"/>
-        <w:rPr>
-          <w:color w:val="auto"/>
-        </w:rPr>
-      </w:pPr>
-      <w:r>
-        <w:rPr>
-          <w:color w:val="auto"/>
-        </w:rPr>
-        <w:t>14. Bước 12 – Form Thêm/Sửa Sinh Viên form.html (TODO 15–17)</w:t>
-      </w:r>
-    </w:p>
-    <w:p>
-      <w:pPr>
-        <w:pStyle w:val="3"/>
-        <w:rPr>
-          <w:color w:val="auto"/>
-        </w:rPr>
-      </w:pPr>
-      <w:r>
-        <w:rPr>
-          <w:color w:val="auto"/>
-        </w:rPr>
-        <w:t>14.1. Liên kết Form dữ liệu và Hiển thị lỗi trường (TODO 15)</w:t>
-      </w:r>
-    </w:p>
-    <w:p>
-      <w:r>
-        <w:t>• Form liên kết với đối tượng th:object="${student}" và action th:action="@{/students/save}".</w:t>
-      </w:r>
-    </w:p>
-    <w:p>
-      <w:r>
-        <w:t>• Mỗi trường nhập dùng th:field="*{tênTrường}", tự động sinh id, name và value.</w:t>
-      </w:r>
-    </w:p>
-    <w:p>
-      <w:r>
-        <w:t>• Tự động thêm viền đỏ khi có lỗi bằng th:errorclass="is-invalid".</w:t>
-      </w:r>
-    </w:p>
-    <w:p>
-      <w:r>
-        <w:t>• Hiển thị thông báo lỗi cụ thể bên dưới ô nhập bằng thẻ th:errors="*{tênTrường}".</w:t>
-      </w:r>
-    </w:p>
-    <w:p>
-      <w:r>
-        <w:t>• Tiêu đề trang thay đổi linh hoạt: th:text="${student.id != null} ? 'Cập Nhật Sinh Viên' : 'Thêm Mới Sinh Viên'".</w:t>
-      </w:r>
-    </w:p>
-    <w:p>
-      <w:pPr>
-        <w:pStyle w:val="3"/>
-        <w:rPr>
-          <w:color w:val="auto"/>
-        </w:rPr>
-      </w:pPr>
-      <w:r>
-        <w:rPr>
-          <w:color w:val="auto"/>
-        </w:rPr>
-        <w:t>14.2. Khối tổng hợp lỗi ở đầu trang (TODO 16)</w:t>
-      </w:r>
-    </w:p>
-    <w:p>
-      <w:pPr>
-        <w:rPr>
-          <w:color w:val="auto"/>
-        </w:rPr>
-      </w:pPr>
-      <w:r>
-        <w:rPr>
-          <w:color w:val="auto"/>
-        </w:rPr>
-        <w:t>Sử dụng th:if="${#fields.hasAnyErrors()}" để hiển thị khung thông báo tổng hợp toàn bộ các lỗi vi phạm validation trong form bằng th:each="err : ${#fields.allErrors()}".</w:t>
-      </w:r>
-    </w:p>
-    <w:p>
-      <w:pPr>
-        <w:pStyle w:val="3"/>
-        <w:rPr>
-          <w:color w:val="auto"/>
-        </w:rPr>
-      </w:pPr>
-      <w:r>
-        <w:rPr>
-          <w:color w:val="auto"/>
-        </w:rPr>
-        <w:t>14.3. Cấu hình thông điệp tiếng Việt (TODO 17)</w:t>
-      </w:r>
-    </w:p>
-    <w:p>
-      <w:r>
-        <w:t>File src/main/resources/messages.properties xử lý lỗi sai kiểu dữ liệu:</w:t>
-      </w:r>
-    </w:p>
-    <w:p>
-      <w:pPr>
-        <w:shd w:val="clear" w:fill="F2F2F2"/>
-        <w:ind w:left="360"/>
-      </w:pPr>
-      <w:r>
-        <w:rPr>
-          <w:rFonts w:ascii="Consolas" w:hAnsi="Consolas"/>
-          <w:color w:val="333333"/>
-          <w:sz w:val="21"/>
-        </w:rPr>
-        <w:t>typeMismatch.student.gpa=Điểm GPA phải là số thập phân hợp lệ từ 0.0 đến 10.0</w:t>
-      </w:r>
-    </w:p>
-    <w:p>
-      <w:pPr>
-        <w:shd w:val="clear" w:fill="F2F2F2"/>
-        <w:ind w:left="360"/>
-      </w:pPr>
-      <w:r>
-        <w:rPr>
-          <w:rFonts w:ascii="Consolas" w:hAnsi="Consolas"/>
-          <w:color w:val="333333"/>
-          <w:sz w:val="21"/>
-        </w:rPr>
-        <w:t>typeMismatch.student.dateOfBirth=Ngày sinh không đúng định dạng (yyyy-MM-dd)</w:t>
-      </w:r>
-    </w:p>
-    <w:p>
-      <w:pPr>
-        <w:jc w:val="center"/>
-      </w:pPr>
-      <w:r>
-        <w:drawing>
-          <wp:inline distT="0" distB="0" distL="114300" distR="114300">
-            <wp:extent cx="5265420" cy="2959100"/>
-            <wp:effectExtent l="0" t="0" r="11430" b="12700"/>
-            <wp:docPr id="8" name="Picture 8"/>
-            <wp:cNvGraphicFramePr>
-              <a:graphicFrameLocks xmlns:a="http://schemas.openxmlformats.org/drawingml/2006/main" noChangeAspect="1"/>
-            </wp:cNvGraphicFramePr>
-            <a:graphic xmlns:a="http://schemas.openxmlformats.org/drawingml/2006/main">
-              <a:graphicData uri="http://schemas.openxmlformats.org/drawingml/2006/picture">
-                <pic:pic xmlns:pic="http://schemas.openxmlformats.org/drawingml/2006/picture">
-                  <pic:nvPicPr>
-                    <pic:cNvPr id="8" name="Picture 8"/>
                     <pic:cNvPicPr>
                       <a:picLocks noChangeAspect="1"/>
                     </pic:cNvPicPr>
@@ -2352,20 +2226,146 @@
           <w:i/>
           <w:color w:val="555555"/>
         </w:rPr>
-        <w:t>Hình 14.1 – Giao diện form thêm mới sinh viên với các trường nhập dữ liệu</w:t>
-      </w:r>
-    </w:p>
-    <w:p/>
-    <w:p>
-      <w:pPr>
-        <w:jc w:val="both"/>
+        <w:t>Hình 13.1 – Trang chi tiết sinh viên hiển thị thông tin, học bổng và tuổi tự động</w:t>
+      </w:r>
+    </w:p>
+    <w:p>
+      <w:pPr>
+        <w:pStyle w:val="2"/>
+        <w:rPr>
+          <w:color w:val="auto"/>
+        </w:rPr>
+      </w:pPr>
+      <w:r>
+        <w:rPr>
+          <w:color w:val="auto"/>
+        </w:rPr>
+        <w:t>14. Bước 12 – Form Thêm/Sửa Sinh Viên form.html (TODO 15–17)</w:t>
+      </w:r>
+    </w:p>
+    <w:p>
+      <w:pPr>
+        <w:pStyle w:val="3"/>
+        <w:rPr>
+          <w:color w:val="auto"/>
+        </w:rPr>
+      </w:pPr>
+      <w:r>
+        <w:rPr>
+          <w:color w:val="auto"/>
+        </w:rPr>
+        <w:t>14.1. Liên kết Form dữ liệu và Hiển thị lỗi trường (TODO 15)</w:t>
+      </w:r>
+    </w:p>
+    <w:p>
+      <w:r>
+        <w:t>• Form liên kết với đối tượng th:object="${student}" và action th:action="@{/students/save}".</w:t>
+      </w:r>
+    </w:p>
+    <w:p>
+      <w:r>
+        <w:t>• Mỗi trường nhập dùng th:field="*{tênTrường}", tự động sinh id, name và value.</w:t>
+      </w:r>
+    </w:p>
+    <w:p>
+      <w:r>
+        <w:t>• Tự động thêm viền đỏ khi có lỗi bằng th:errorclass="is-invalid".</w:t>
+      </w:r>
+    </w:p>
+    <w:p>
+      <w:r>
+        <w:t>• Hiển thị thông báo lỗi cụ thể bên dưới ô nhập bằng thẻ th:errors="*{tênTrường}".</w:t>
+      </w:r>
+    </w:p>
+    <w:p>
+      <w:r>
+        <w:t>• Tiêu đề trang thay đổi linh hoạt: th:text="${student.id != null} ? 'Cập Nhật Sinh Viên' : 'Thêm Mới Sinh Viên'".</w:t>
+      </w:r>
+    </w:p>
+    <w:p>
+      <w:pPr>
+        <w:pStyle w:val="3"/>
+        <w:rPr>
+          <w:color w:val="auto"/>
+        </w:rPr>
+      </w:pPr>
+      <w:r>
+        <w:rPr>
+          <w:color w:val="auto"/>
+        </w:rPr>
+        <w:t>14.2. Khối tổng hợp lỗi ở đầu trang (TODO 16)</w:t>
+      </w:r>
+    </w:p>
+    <w:p>
+      <w:pPr>
+        <w:rPr>
+          <w:color w:val="auto"/>
+        </w:rPr>
+      </w:pPr>
+      <w:r>
+        <w:rPr>
+          <w:color w:val="auto"/>
+        </w:rPr>
+        <w:t>Sử dụng th:if="${#fields.hasAnyErrors()}" để hiển thị khung thông báo tổng hợp toàn bộ các lỗi vi phạm validation trong form bằng th:each="err : ${#fields.allErrors()}".</w:t>
+      </w:r>
+    </w:p>
+    <w:p>
+      <w:pPr>
+        <w:pStyle w:val="3"/>
+        <w:rPr>
+          <w:color w:val="auto"/>
+        </w:rPr>
+      </w:pPr>
+      <w:r>
+        <w:rPr>
+          <w:color w:val="auto"/>
+        </w:rPr>
+        <w:t>14.3. Cấu hình thông điệp tiếng Việt (TODO 17)</w:t>
+      </w:r>
+    </w:p>
+    <w:p>
+      <w:r>
+        <w:t>File src/main/resources/messages.properties xử lý lỗi sai kiểu dữ liệu:</w:t>
+      </w:r>
+    </w:p>
+    <w:p>
+      <w:pPr>
+        <w:shd w:val="clear" w:fill="F2F2F2"/>
+        <w:ind w:left="360"/>
+      </w:pPr>
+      <w:r>
+        <w:rPr>
+          <w:rFonts w:ascii="Consolas" w:hAnsi="Consolas"/>
+          <w:color w:val="333333"/>
+          <w:sz w:val="21"/>
+        </w:rPr>
+        <w:t>typeMismatch.student.gpa=Điểm GPA phải là số thập phân hợp lệ từ 0.0 đến 10.0</w:t>
+      </w:r>
+    </w:p>
+    <w:p>
+      <w:pPr>
+        <w:shd w:val="clear" w:fill="F2F2F2"/>
+        <w:ind w:left="360"/>
+      </w:pPr>
+      <w:r>
+        <w:rPr>
+          <w:rFonts w:ascii="Consolas" w:hAnsi="Consolas"/>
+          <w:color w:val="333333"/>
+          <w:sz w:val="21"/>
+        </w:rPr>
+        <w:t>typeMismatch.student.dateOfBirth=Ngày sinh không đúng định dạng (yyyy-MM-dd)</w:t>
+      </w:r>
+    </w:p>
+    <w:p>
+      <w:pPr>
+        <w:jc w:val="center"/>
       </w:pPr>
       <w:r>
         <w:drawing>
           <wp:inline distT="0" distB="0" distL="114300" distR="114300">
             <wp:extent cx="5265420" cy="2959100"/>
             <wp:effectExtent l="0" t="0" r="11430" b="12700"/>
-            <wp:docPr id="9" name="Picture 9"/>
+            <wp:docPr id="8" name="Picture 8"/>
             <wp:cNvGraphicFramePr>
               <a:graphicFrameLocks xmlns:a="http://schemas.openxmlformats.org/drawingml/2006/main" noChangeAspect="1"/>
             </wp:cNvGraphicFramePr>
@@ -2373,7 +2373,7 @@
               <a:graphicData uri="http://schemas.openxmlformats.org/drawingml/2006/picture">
                 <pic:pic xmlns:pic="http://schemas.openxmlformats.org/drawingml/2006/picture">
                   <pic:nvPicPr>
-                    <pic:cNvPr id="9" name="Picture 9"/>
+                    <pic:cNvPr id="8" name="Picture 8"/>
                     <pic:cNvPicPr>
                       <a:picLocks noChangeAspect="1"/>
                     </pic:cNvPicPr>
@@ -2408,6 +2408,62 @@
           <w:i/>
           <w:color w:val="555555"/>
         </w:rPr>
+        <w:t>Hình 14.1 – Giao diện form thêm mới sinh viên với các trường nhập dữ liệu</w:t>
+      </w:r>
+    </w:p>
+    <w:p/>
+    <w:p>
+      <w:pPr>
+        <w:jc w:val="both"/>
+      </w:pPr>
+      <w:r>
+        <w:drawing>
+          <wp:inline distT="0" distB="0" distL="114300" distR="114300">
+            <wp:extent cx="5265420" cy="2959100"/>
+            <wp:effectExtent l="0" t="0" r="11430" b="12700"/>
+            <wp:docPr id="9" name="Picture 9"/>
+            <wp:cNvGraphicFramePr>
+              <a:graphicFrameLocks xmlns:a="http://schemas.openxmlformats.org/drawingml/2006/main" noChangeAspect="1"/>
+            </wp:cNvGraphicFramePr>
+            <a:graphic xmlns:a="http://schemas.openxmlformats.org/drawingml/2006/main">
+              <a:graphicData uri="http://schemas.openxmlformats.org/drawingml/2006/picture">
+                <pic:pic xmlns:pic="http://schemas.openxmlformats.org/drawingml/2006/picture">
+                  <pic:nvPicPr>
+                    <pic:cNvPr id="9" name="Picture 9"/>
+                    <pic:cNvPicPr>
+                      <a:picLocks noChangeAspect="1"/>
+                    </pic:cNvPicPr>
+                  </pic:nvPicPr>
+                  <pic:blipFill>
+                    <a:blip r:embed="rId18"/>
+                    <a:stretch>
+                      <a:fillRect/>
+                    </a:stretch>
+                  </pic:blipFill>
+                  <pic:spPr>
+                    <a:xfrm>
+                      <a:off x="0" y="0"/>
+                      <a:ext cx="5265420" cy="2959100"/>
+                    </a:xfrm>
+                    <a:prstGeom prst="rect">
+                      <a:avLst/>
+                    </a:prstGeom>
+                    <a:noFill/>
+                    <a:ln>
+                      <a:noFill/>
+                    </a:ln>
+                  </pic:spPr>
+                </pic:pic>
+              </a:graphicData>
+            </a:graphic>
+          </wp:inline>
+        </w:drawing>
+      </w:r>
+      <w:r>
+        <w:rPr>
+          <w:i/>
+          <w:color w:val="555555"/>
+        </w:rPr>
         <w:t>Hình 14.2 – Hiển thị lỗi kiểm tra dữ liệu Bean Validation tiếng Việt khi nhập sai</w:t>
       </w:r>
     </w:p>
@@ -2489,7 +2545,7 @@
                     </pic:cNvPicPr>
                   </pic:nvPicPr>
                   <pic:blipFill>
-                    <a:blip r:embed="rId18"/>
+                    <a:blip r:embed="rId19"/>
                     <a:stretch>
                       <a:fillRect/>
                     </a:stretch>
@@ -2545,7 +2601,7 @@
                     </pic:cNvPicPr>
                   </pic:nvPicPr>
                   <pic:blipFill>
-                    <a:blip r:embed="rId19"/>
+                    <a:blip r:embed="rId20"/>
                     <a:stretch>
                       <a:fillRect/>
                     </a:stretch>
@@ -2662,7 +2718,7 @@
                     </pic:cNvPicPr>
                   </pic:nvPicPr>
                   <pic:blipFill>
-                    <a:blip r:embed="rId20"/>
+                    <a:blip r:embed="rId21"/>
                     <a:stretch>
                       <a:fillRect/>
                     </a:stretch>
@@ -2801,7 +2857,7 @@
                     </pic:cNvPicPr>
                   </pic:nvPicPr>
                   <pic:blipFill>
-                    <a:blip r:embed="rId21"/>
+                    <a:blip r:embed="rId22"/>
                     <a:stretch>
                       <a:fillRect/>
                     </a:stretch>
@@ -2898,12 +2954,6 @@
             <w:insideH w:val="single" w:color="D9D9D9" w:sz="4" w:space="0"/>
             <w:insideV w:val="single" w:color="D9D9D9" w:sz="4" w:space="0"/>
           </w:tblBorders>
-          <w:tblCellMar>
-            <w:top w:w="0" w:type="dxa"/>
-            <w:left w:w="10" w:type="dxa"/>
-            <w:bottom w:w="0" w:type="dxa"/>
-            <w:right w:w="10" w:type="dxa"/>
-          </w:tblCellMar>
         </w:tblPrEx>
         <w:tc>
           <w:tcPr>

</xml_diff>